<commit_message>
Feedback from test case
</commit_message>
<xml_diff>
--- a/assets/brd-template.docx
+++ b/assets/brd-template.docx
@@ -90,37 +90,7 @@
                                 <w:sz w:val="32"/>
                                 <w:szCs w:val="32"/>
                               </w:rPr>
-                              <w:t>[</w:t>
-                            </w:r>
-                            <w:r>
-                              <w:rPr>
-                                <w:sz w:val="32"/>
-                                <w:szCs w:val="32"/>
-                              </w:rPr>
-                              <w:t>Extend</w:t>
-                            </w:r>
-                            <w:r>
-                              <w:rPr>
-                                <w:sz w:val="32"/>
-                                <w:szCs w:val="32"/>
-                              </w:rPr>
-                              <w:t>/</w:t>
-                            </w:r>
-                            <w:proofErr w:type="spellStart"/>
-                            <w:r>
-                              <w:rPr>
-                                <w:sz w:val="32"/>
-                                <w:szCs w:val="32"/>
-                              </w:rPr>
-                              <w:t>BoW</w:t>
-                            </w:r>
-                            <w:proofErr w:type="spellEnd"/>
-                            <w:r>
-                              <w:rPr>
-                                <w:sz w:val="32"/>
-                                <w:szCs w:val="32"/>
-                              </w:rPr>
-                              <w:t xml:space="preserve"> App Name]</w:t>
+                              <w:t xml:space="preserve">[Extend/BoW App Name]</w:t>
                             </w:r>
                           </w:p>
                           <w:p/>
@@ -129,10 +99,7 @@
                               <w:pStyle w:val="Subtitle"/>
                             </w:pPr>
                             <w:r>
-                              <w:t xml:space="preserve">Prepared for </w:t>
-                            </w:r>
-                            <w:r>
-                              <w:t>[CLIENT]</w:t>
+                              <w:t xml:space="preserve">Prepared for [CLIENT]</w:t>
                             </w:r>
                           </w:p>
                           <w:p>
@@ -182,37 +149,7 @@
                           <w:sz w:val="32"/>
                           <w:szCs w:val="32"/>
                         </w:rPr>
-                        <w:t>[</w:t>
-                      </w:r>
-                      <w:r>
-                        <w:rPr>
-                          <w:sz w:val="32"/>
-                          <w:szCs w:val="32"/>
-                        </w:rPr>
-                        <w:t>Extend</w:t>
-                      </w:r>
-                      <w:r>
-                        <w:rPr>
-                          <w:sz w:val="32"/>
-                          <w:szCs w:val="32"/>
-                        </w:rPr>
-                        <w:t>/</w:t>
-                      </w:r>
-                      <w:proofErr w:type="spellStart"/>
-                      <w:r>
-                        <w:rPr>
-                          <w:sz w:val="32"/>
-                          <w:szCs w:val="32"/>
-                        </w:rPr>
-                        <w:t>BoW</w:t>
-                      </w:r>
-                      <w:proofErr w:type="spellEnd"/>
-                      <w:r>
-                        <w:rPr>
-                          <w:sz w:val="32"/>
-                          <w:szCs w:val="32"/>
-                        </w:rPr>
-                        <w:t xml:space="preserve"> App Name]</w:t>
+                        <w:t xml:space="preserve">[Extend/BoW App Name]</w:t>
                       </w:r>
                     </w:p>
                     <w:p/>
@@ -221,10 +158,7 @@
                         <w:pStyle w:val="Subtitle"/>
                       </w:pPr>
                       <w:r>
-                        <w:t xml:space="preserve">Prepared for </w:t>
-                      </w:r>
-                      <w:r>
-                        <w:t>[CLIENT]</w:t>
+                        <w:t xml:space="preserve">Prepared for [CLIENT]</w:t>
                       </w:r>
                     </w:p>
                     <w:p>
@@ -1650,31 +1584,7 @@
         <w:pStyle w:val="NoSpacing"/>
       </w:pPr>
       <w:r>
-        <w:t>S</w:t>
-      </w:r>
-      <w:r>
-        <w:t xml:space="preserve">ummary of our </w:t>
-      </w:r>
-      <w:r>
-        <w:t>understanding of</w:t>
-      </w:r>
-      <w:r>
-        <w:t xml:space="preserve"> the business </w:t>
-      </w:r>
-      <w:r>
-        <w:t>problems</w:t>
-      </w:r>
-      <w:r>
-        <w:t xml:space="preserve"> we are solving </w:t>
-      </w:r>
-      <w:r>
-        <w:t xml:space="preserve">for </w:t>
-      </w:r>
-      <w:r>
-        <w:t xml:space="preserve">and </w:t>
-      </w:r>
-      <w:r>
-        <w:t>what the solution will bridge the gap for.</w:t>
+        <w:t xml:space="preserve">Summary of our understanding of the business problems we are solving for and what the solution will bridge the gap for.</w:t>
       </w:r>
     </w:p>
     <w:p>
@@ -1696,10 +1606,7 @@
       </w:pPr>
       <w:r>
         <w:lastRenderedPageBreak/>
-        <w:t>Process</w:t>
-      </w:r>
-      <w:r>
-        <w:t>es</w:t>
+        <w:t>Features</w:t>
       </w:r>
     </w:p>
     <w:tbl>
@@ -1745,7 +1652,7 @@
                 <w:sz w:val="20"/>
                 <w:szCs w:val="20"/>
               </w:rPr>
-              <w:t>Process #</w:t>
+              <w:t>Feature #</w:t>
             </w:r>
           </w:p>
         </w:tc>
@@ -1766,14 +1673,7 @@
                 <w:sz w:val="20"/>
                 <w:szCs w:val="20"/>
               </w:rPr>
-              <w:t xml:space="preserve">Use an active verb phrase to describe this </w:t>
-            </w:r>
-            <w:r>
-              <w:rPr>
-                <w:sz w:val="20"/>
-                <w:szCs w:val="20"/>
-              </w:rPr>
-              <w:t>process</w:t>
+              <w:t xml:space="preserve">Use an active verb phrase to describe this feature</w:t>
             </w:r>
           </w:p>
         </w:tc>
@@ -2126,7 +2026,7 @@
     <w:p/>
     <w:p>
       <w:r>
-        <w:t>[[Insert Process Flow Diagram]]</w:t>
+        <w:t>[[Insert Feature Flow Diagram]]</w:t>
       </w:r>
     </w:p>
     <w:p/>
@@ -2183,7 +2083,7 @@
                 <w:szCs w:val="20"/>
               </w:rPr>
               <w:lastRenderedPageBreak/>
-              <w:t xml:space="preserve">Process </w:t>
+              <w:t xml:space="preserve">Feature </w:t>
             </w:r>
             <w:r>
               <w:rPr>
@@ -2211,14 +2111,7 @@
                 <w:sz w:val="20"/>
                 <w:szCs w:val="20"/>
               </w:rPr>
-              <w:t xml:space="preserve">Use an active verb phrase to describe this </w:t>
-            </w:r>
-            <w:r>
-              <w:rPr>
-                <w:sz w:val="20"/>
-                <w:szCs w:val="20"/>
-              </w:rPr>
-              <w:t>process</w:t>
+              <w:t xml:space="preserve">Use an active verb phrase to describe this feature</w:t>
             </w:r>
           </w:p>
         </w:tc>
@@ -2571,7 +2464,7 @@
     <w:p/>
     <w:p>
       <w:r>
-        <w:t>[[Insert Process Flow Diagram]]</w:t>
+        <w:t>[[Insert Feature Flow Diagram]]</w:t>
       </w:r>
       <w:r>
         <w:br w:type="page"/>
@@ -2621,7 +2514,7 @@
                 <w:szCs w:val="20"/>
               </w:rPr>
               <w:lastRenderedPageBreak/>
-              <w:t>Process</w:t>
+              <w:t>Feature</w:t>
             </w:r>
             <w:r>
               <w:rPr>
@@ -2649,14 +2542,7 @@
                 <w:sz w:val="20"/>
                 <w:szCs w:val="20"/>
               </w:rPr>
-              <w:t xml:space="preserve">Use an active verb phrase to describe this </w:t>
-            </w:r>
-            <w:r>
-              <w:rPr>
-                <w:sz w:val="20"/>
-                <w:szCs w:val="20"/>
-              </w:rPr>
-              <w:t>process</w:t>
+              <w:t xml:space="preserve">Use an active verb phrase to describe this feature</w:t>
             </w:r>
           </w:p>
         </w:tc>
@@ -3009,7 +2895,7 @@
     <w:p/>
     <w:p>
       <w:r>
-        <w:t>[[Insert Process Flow Diagram]]</w:t>
+        <w:t>[[Insert Feature Flow Diagram]]</w:t>
       </w:r>
     </w:p>
     <w:p>
@@ -3044,10 +2930,7 @@
     </w:p>
     <w:p>
       <w:r>
-        <w:t>The following integrations are required to transmit data between Workday and external systems</w:t>
-      </w:r>
-      <w:r>
-        <w:t xml:space="preserve">. </w:t>
+        <w:t xml:space="preserve">The following integrations are required to transmit data between Workday and external systems. </w:t>
       </w:r>
     </w:p>
     <w:tbl>
@@ -3269,14 +3152,7 @@
           <w:sz w:val="26"/>
           <w:szCs w:val="26"/>
         </w:rPr>
-        <w:t>Requirements</w:t>
-      </w:r>
-      <w:r>
-        <w:rPr>
-          <w:sz w:val="26"/>
-          <w:szCs w:val="26"/>
-        </w:rPr>
-        <w:t xml:space="preserve"> </w:t>
+        <w:t xml:space="preserve">Requirements </w:t>
       </w:r>
     </w:p>
     <w:tbl>
@@ -3432,14 +3308,7 @@
           <w:sz w:val="26"/>
           <w:szCs w:val="26"/>
         </w:rPr>
-        <w:t xml:space="preserve">Data Retention </w:t>
-      </w:r>
-      <w:r>
-        <w:rPr>
-          <w:sz w:val="26"/>
-          <w:szCs w:val="26"/>
-        </w:rPr>
-        <w:t>Requirements</w:t>
+        <w:t xml:space="preserve">Data Retention Requirements</w:t>
       </w:r>
     </w:p>
     <w:p>
@@ -3462,14 +3331,7 @@
           <w:sz w:val="26"/>
           <w:szCs w:val="26"/>
         </w:rPr>
-        <w:t xml:space="preserve">Security </w:t>
-      </w:r>
-      <w:r>
-        <w:rPr>
-          <w:sz w:val="26"/>
-          <w:szCs w:val="26"/>
-        </w:rPr>
-        <w:t>R</w:t>
+        <w:t xml:space="preserve">Security R</w:t>
       </w:r>
       <w:bookmarkEnd w:id="2"/>
       <w:r>
@@ -3477,40 +3339,12 @@
           <w:sz w:val="26"/>
           <w:szCs w:val="26"/>
         </w:rPr>
-        <w:t>equirements</w:t>
-      </w:r>
-      <w:r>
-        <w:rPr>
-          <w:sz w:val="26"/>
-          <w:szCs w:val="26"/>
-        </w:rPr>
-        <w:t xml:space="preserve"> </w:t>
+        <w:t xml:space="preserve">equirements </w:t>
       </w:r>
     </w:p>
     <w:p>
       <w:r>
-        <w:t xml:space="preserve">Security roles </w:t>
-      </w:r>
-      <w:r>
-        <w:t xml:space="preserve">to facilitate the </w:t>
-      </w:r>
-      <w:r>
-        <w:t>application’s processes</w:t>
-      </w:r>
-      <w:r>
-        <w:t xml:space="preserve"> will be created/managed include</w:t>
-      </w:r>
-      <w:r>
-        <w:t xml:space="preserve">. </w:t>
-      </w:r>
-      <w:r>
-        <w:t>[[Client]]</w:t>
-      </w:r>
-      <w:r>
-        <w:t xml:space="preserve"> will own creation of these roles to facilitate dashboard access</w:t>
-      </w:r>
-      <w:r>
-        <w:t>:</w:t>
+        <w:t xml:space="preserve">Security roles to facilitate the application’s processes will be created/managed include. [[Client]] will own creation of these roles to facilitate dashboard access:</w:t>
       </w:r>
     </w:p>
     <w:tbl>
@@ -3740,42 +3574,7 @@
           <w:rFonts w:eastAsia="Lato" w:cs="Lato"/>
           <w:szCs w:val="24"/>
         </w:rPr>
-        <w:t>The Extend app will be available in</w:t>
-      </w:r>
-      <w:r>
-        <w:rPr>
-          <w:rFonts w:eastAsia="Lato" w:cs="Lato"/>
-          <w:szCs w:val="24"/>
-        </w:rPr>
-        <w:t xml:space="preserve"> </w:t>
-      </w:r>
-      <w:r>
-        <w:rPr>
-          <w:rFonts w:eastAsia="Lato" w:cs="Lato"/>
-          <w:szCs w:val="24"/>
-        </w:rPr>
-        <w:t>US English</w:t>
-      </w:r>
-      <w:r>
-        <w:rPr>
-          <w:rFonts w:eastAsia="Lato" w:cs="Lato"/>
-          <w:szCs w:val="24"/>
-        </w:rPr>
-        <w:t xml:space="preserve">, </w:t>
-      </w:r>
-      <w:r>
-        <w:rPr>
-          <w:rFonts w:eastAsia="Lato" w:cs="Lato"/>
-          <w:szCs w:val="24"/>
-        </w:rPr>
-        <w:t>US Spanish</w:t>
-      </w:r>
-      <w:r>
-        <w:rPr>
-          <w:rFonts w:eastAsia="Lato" w:cs="Lato"/>
-          <w:szCs w:val="24"/>
-        </w:rPr>
-        <w:t xml:space="preserve">, and </w:t>
+        <w:t xml:space="preserve">The Extend app will be available in US English, US Spanish, and </w:t>
       </w:r>
       <w:r>
         <w:t>French-Canadian</w:t>
@@ -4099,17 +3898,9 @@
         <w:rPr>
           <w:lang w:val="fr-FR"/>
         </w:rPr>
-        <w:t xml:space="preserve">UI </w:t>
-      </w:r>
-      <w:proofErr w:type="spellStart"/>
-      <w:r>
-        <w:rPr>
-          <w:lang w:val="fr-FR"/>
-        </w:rPr>
-        <w:t>Mockups</w:t>
+        <w:t xml:space="preserve">UI Mockups</w:t>
       </w:r>
       <w:bookmarkEnd w:id="7"/>
-      <w:proofErr w:type="spellEnd"/>
     </w:p>
     <w:p>
       <w:pPr>
@@ -4156,16 +3947,7 @@
     </w:p>
     <w:p>
       <w:r>
-        <w:t>Model Components create data, logic, and security components that are consistent with the object model, business process framework, and configurable security model in Workday.</w:t>
-      </w:r>
-      <w:r>
-        <w:t xml:space="preserve">  </w:t>
-      </w:r>
-      <w:r>
-        <w:t>Model Components enable the Extend application to create new</w:t>
-      </w:r>
-      <w:r>
-        <w:t xml:space="preserve"> data structures and secure them within the Workday security framework.</w:t>
+        <w:t xml:space="preserve">Model Components create data, logic, and security components that are consistent with the object model, business process framework, and configurable security model in Workday.  Model Components enable the Extend application to create new data structures and secure them within the Workday security framework.</w:t>
       </w:r>
     </w:p>
     <w:p>
@@ -4180,15 +3962,7 @@
     </w:p>
     <w:p>
       <w:r>
-        <w:t xml:space="preserve">Business Objects are </w:t>
-      </w:r>
-      <w:proofErr w:type="spellStart"/>
-      <w:r>
-        <w:t>businessobject</w:t>
-      </w:r>
-      <w:proofErr w:type="spellEnd"/>
-      <w:r>
-        <w:t xml:space="preserve"> files that define the core of the data model for an app and are used to store app data. They can reference Workday-delivered business objects or other business objects that you define in your app.</w:t>
+        <w:t xml:space="preserve">Business Objects are businessobject files that define the core of the data model for an app and are used to store app data. They can reference Workday-delivered business objects or other business objects that you define in your app.</w:t>
       </w:r>
     </w:p>
     <w:tbl>
@@ -4285,31 +4059,7 @@
               <w:rPr>
                 <w:szCs w:val="24"/>
               </w:rPr>
-              <w:t>B</w:t>
-            </w:r>
-            <w:r>
-              <w:rPr>
-                <w:szCs w:val="24"/>
-              </w:rPr>
-              <w:t>udgets entered by Comp</w:t>
-            </w:r>
-            <w:r>
-              <w:rPr>
-                <w:szCs w:val="24"/>
-              </w:rPr>
-              <w:t>ensation</w:t>
-            </w:r>
-            <w:r>
-              <w:rPr>
-                <w:szCs w:val="24"/>
-              </w:rPr>
-              <w:t xml:space="preserve"> Admin, tied to org and including the cycle that it's for (i.e. 2025P1</w:t>
-            </w:r>
-            <w:r>
-              <w:rPr>
-                <w:szCs w:val="24"/>
-              </w:rPr>
-              <w:t>).</w:t>
+              <w:t xml:space="preserve">Budgets entered by Compensation Admin, tied to org and including the cycle that it's for (i.e. 2025P1).</w:t>
             </w:r>
           </w:p>
         </w:tc>
@@ -4332,26 +4082,27 @@
               <w:rPr>
                 <w:szCs w:val="24"/>
               </w:rPr>
-              <w:t>Promotion</w:t>
-            </w:r>
-            <w:r>
+              <w:t xml:space="preserve">Promotion Nomination Worker</w:t>
+            </w:r>
+          </w:p>
+        </w:tc>
+        <w:tc>
+          <w:tcPr>
+            <w:tcW w:w="7560" w:type="dxa"/>
+          </w:tcPr>
+          <w:p>
+            <w:pPr>
               <w:rPr>
                 <w:szCs w:val="24"/>
               </w:rPr>
-              <w:t xml:space="preserve"> Nomination</w:t>
-            </w:r>
+            </w:pPr>
             <w:r>
               <w:rPr>
                 <w:szCs w:val="24"/>
               </w:rPr>
-              <w:t xml:space="preserve"> Worker</w:t>
-            </w:r>
-          </w:p>
-        </w:tc>
-        <w:tc>
-          <w:tcPr>
-            <w:tcW w:w="7560" w:type="dxa"/>
-          </w:tcPr>
+              <w:t xml:space="preserve">Nomination record for each worker, either for promotion or just comp change. needs to capture all information that we need to capture for the SOAP API.</w:t>
+            </w:r>
+          </w:p>
           <w:p>
             <w:pPr>
               <w:rPr>
@@ -4362,92 +4113,7 @@
               <w:rPr>
                 <w:szCs w:val="24"/>
               </w:rPr>
-              <w:t>Nomination record for each worker, either for promotion or just comp change. needs to capture all information that we need to capture for the SOAP API</w:t>
-            </w:r>
-            <w:r>
-              <w:rPr>
-                <w:szCs w:val="24"/>
-              </w:rPr>
-              <w:t>.</w:t>
-            </w:r>
-          </w:p>
-          <w:p>
-            <w:pPr>
-              <w:rPr>
-                <w:szCs w:val="24"/>
-              </w:rPr>
-            </w:pPr>
-            <w:r>
-              <w:rPr>
-                <w:szCs w:val="24"/>
-              </w:rPr>
-              <w:t>A numeric field</w:t>
-            </w:r>
-            <w:r>
-              <w:rPr>
-                <w:szCs w:val="24"/>
-              </w:rPr>
-              <w:t xml:space="preserve"> will</w:t>
-            </w:r>
-            <w:r>
-              <w:rPr>
-                <w:szCs w:val="24"/>
-              </w:rPr>
-              <w:t xml:space="preserve"> be available on this business object to allow for a ‘benchmark</w:t>
-            </w:r>
-            <w:r>
-              <w:rPr>
-                <w:szCs w:val="24"/>
-              </w:rPr>
-              <w:t xml:space="preserve"> salary</w:t>
-            </w:r>
-            <w:r>
-              <w:rPr>
-                <w:szCs w:val="24"/>
-              </w:rPr>
-              <w:t>’</w:t>
-            </w:r>
-            <w:r>
-              <w:rPr>
-                <w:szCs w:val="24"/>
-              </w:rPr>
-              <w:t xml:space="preserve"> when</w:t>
-            </w:r>
-            <w:r>
-              <w:rPr>
-                <w:szCs w:val="24"/>
-              </w:rPr>
-              <w:t xml:space="preserve"> considering</w:t>
-            </w:r>
-            <w:r>
-              <w:rPr>
-                <w:szCs w:val="24"/>
-              </w:rPr>
-              <w:t xml:space="preserve"> </w:t>
-            </w:r>
-            <w:r>
-              <w:rPr>
-                <w:szCs w:val="24"/>
-              </w:rPr>
-              <w:t xml:space="preserve">nominations. This field will </w:t>
-            </w:r>
-            <w:r>
-              <w:rPr>
-                <w:szCs w:val="24"/>
-              </w:rPr>
-              <w:t>be entered in manually</w:t>
-            </w:r>
-            <w:r>
-              <w:rPr>
-                <w:szCs w:val="24"/>
-              </w:rPr>
-              <w:t>.</w:t>
-            </w:r>
-            <w:r>
-              <w:rPr>
-                <w:szCs w:val="24"/>
-              </w:rPr>
-              <w:t xml:space="preserve"> </w:t>
+              <w:t xml:space="preserve">A numeric field will be available on this business object to allow for a ‘benchmark salary’ when considering nominations. This field will be entered in manually. </w:t>
             </w:r>
           </w:p>
         </w:tc>
@@ -4511,15 +4177,7 @@
     </w:p>
     <w:p>
       <w:r>
-        <w:t xml:space="preserve">Security Domains are </w:t>
-      </w:r>
-      <w:proofErr w:type="spellStart"/>
-      <w:r>
-        <w:t>securitydomain</w:t>
-      </w:r>
-      <w:proofErr w:type="spellEnd"/>
-      <w:r>
-        <w:t xml:space="preserve"> files that secure all other model components in the same app. Each domain requires security policies for finer control.</w:t>
+        <w:t xml:space="preserve">Security Domains are securitydomain files that secure all other model components in the same app. Each domain requires security policies for finer control.</w:t>
       </w:r>
     </w:p>
     <w:tbl>
@@ -4598,25 +4256,7 @@
               <w:rPr>
                 <w:szCs w:val="24"/>
               </w:rPr>
-              <w:t xml:space="preserve">Promotion </w:t>
-            </w:r>
-            <w:r>
-              <w:rPr>
-                <w:szCs w:val="24"/>
-              </w:rPr>
-              <w:t>Nomination</w:t>
-            </w:r>
-            <w:r>
-              <w:rPr>
-                <w:szCs w:val="24"/>
-              </w:rPr>
-              <w:t xml:space="preserve"> </w:t>
-            </w:r>
-            <w:r>
-              <w:rPr>
-                <w:szCs w:val="24"/>
-              </w:rPr>
-              <w:t>Security Domain</w:t>
+              <w:t xml:space="preserve">Promotion Nomination Security Domain</w:t>
             </w:r>
           </w:p>
         </w:tc>

</xml_diff>

<commit_message>
Added one-pager for use
</commit_message>
<xml_diff>
--- a/assets/brd-template.docx
+++ b/assets/brd-template.docx
@@ -41,7 +41,7 @@
               <wp:anchor distT="45720" distB="45720" distL="114300" distR="114300" simplePos="0" relativeHeight="251658240" behindDoc="0" locked="0" layoutInCell="1" allowOverlap="1" wp14:anchorId="1880B8B7" wp14:editId="23F61FE4">
                 <wp:simplePos x="0" y="0"/>
                 <wp:positionH relativeFrom="page">
-                  <wp:align>left</wp:align>
+                  <wp:posOffset>0</wp:posOffset>
                 </wp:positionH>
                 <wp:positionV relativeFrom="paragraph">
                   <wp:posOffset>171548</wp:posOffset>
@@ -112,7 +112,7 @@
                           </w:p>
                         </w:txbxContent>
                       </wps:txbx>
-                      <wps:bodyPr rot="0" vert="horz" wrap="square" lIns="91440" tIns="45720" rIns="91440" bIns="45720" anchor="t" anchorCtr="0">
+                      <wps:bodyPr rot="0" vert="horz" wrap="square" lIns="64008" tIns="45720" rIns="91440" bIns="45720" anchor="t" anchorCtr="0">
                         <a:noAutofit/>
                       </wps:bodyPr>
                     </wps:wsp>
@@ -133,8 +133,8 @@
                 <v:stroke joinstyle="miter"/>
                 <v:path gradientshapeok="t" o:connecttype="rect"/>
               </v:shapetype>
-              <v:shape id="Text Box 2" o:spid="_x0000_s1026" type="#_x0000_t202" style="position:absolute;margin-left:0;margin-top:13.5pt;width:453.5pt;height:102.75pt;z-index:251658240;visibility:visible;mso-wrap-style:square;mso-width-percent:0;mso-height-percent:0;mso-wrap-distance-left:9pt;mso-wrap-distance-top:3.6pt;mso-wrap-distance-right:9pt;mso-wrap-distance-bottom:3.6pt;mso-position-horizontal:left;mso-position-horizontal-relative:page;mso-position-vertical:absolute;mso-position-vertical-relative:text;mso-width-percent:0;mso-height-percent:0;mso-width-relative:margin;mso-height-relative:margin;v-text-anchor:top" o:gfxdata="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" filled="f" stroked="f">
-                <v:textbox>
+              <v:shape id="Text Box 2" o:spid="_x0000_s1026" type="#_x0000_t202" style="position:absolute;margin-left:0;margin-top:13.5pt;width:453.5pt;height:102.75pt;z-index:251658240;visibility:visible;mso-wrap-style:square;mso-width-percent:0;mso-height-percent:0;mso-wrap-distance-left:9pt;mso-wrap-distance-top:3.6pt;mso-wrap-distance-right:9pt;mso-wrap-distance-bottom:3.6pt;mso-position-horizontal:absolute;mso-position-horizontal-relative:page;mso-position-vertical:absolute;mso-position-vertical-relative:text;mso-width-percent:0;mso-height-percent:0;mso-width-relative:margin;mso-height-relative:margin;v-text-anchor:top" o:gfxdata="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" filled="f" stroked="f">
+                <v:textbox inset="0.07in,0.05in,0.1in,0.05in">
                   <w:txbxContent>
                     <w:p>
                       <w:pPr>

</xml_diff>